<commit_message>
Fix Q1 strace filter to capture dup3 (glibc dup2 on modern kernels); update report and README accordingly
</commit_message>
<xml_diff>
--- a/docs/Project2_Report.docx
+++ b/docs/Project2_Report.docx
@@ -385,7 +385,7 @@
           <w:szCs w:val="18"/>
         </w:rPr>
         <w:br/>
-        <w:t xml:space="preserve">  -e trace=process,pipe,fork,vfork,clone,execve,dup2,close,read,write,open,openat \</w:t>
+        <w:t xml:space="preserve">  -e trace=process,pipe,pipe2,fork,vfork,clone,execve,dup2,dup3,close,read,write,open,openat \</w:t>
       </w:r>
       <w:r>
         <w:rPr>
@@ -395,6 +395,17 @@
         </w:rPr>
         <w:br/>
         <w:t xml:space="preserve">  -o strace_logs/q1_strace_filtered.log ./pipeline_ipc root pipeline_output.txt</w:t>
+      </w:r>
+    </w:p>
+    <w:p>
+      <w:pPr>
+        <w:spacing w:after="120"/>
+      </w:pPr>
+      <w:r>
+        <w:rPr>
+          <w:rFonts w:ascii="Calibri" w:cs="Calibri" w:eastAsia="Calibri" w:hAnsi="Calibri"/>
+        </w:rPr>
+        <w:t xml:space="preserve">Note that dup3 (not dup2) must be included in the filter expression on modern kernels: glibc translates the portable dup2() library call into the newer dup3 system call, and on aarch64 the legacy dup2 syscall number does not exist at all.</w:t>
       </w:r>
     </w:p>
     <w:p>
@@ -465,7 +476,34 @@
           <w:szCs w:val="18"/>
         </w:rPr>
         <w:br/>
+        <w:t xml:space="preserve">40  dup3(4, 1, 0)  = 1        (child 1: stdout -&gt; pipe write end)</w:t>
+      </w:r>
+      <w:r>
+        <w:rPr>
+          <w:rFonts w:ascii="Consolas" w:cs="Consolas" w:eastAsia="Consolas" w:hAnsi="Consolas"/>
+          <w:sz w:val="18"/>
+          <w:szCs w:val="18"/>
+        </w:rPr>
+        <w:br/>
+        <w:t xml:space="preserve">41  dup3(3, 0, 0)  = 0        (child 2: stdin  &lt;- pipe read end)</w:t>
+      </w:r>
+      <w:r>
+        <w:rPr>
+          <w:rFonts w:ascii="Consolas" w:cs="Consolas" w:eastAsia="Consolas" w:hAnsi="Consolas"/>
+          <w:sz w:val="18"/>
+          <w:szCs w:val="18"/>
+        </w:rPr>
+        <w:br/>
         <w:t xml:space="preserve">41  openat(AT_FDCWD, "pipeline_output.txt", O_WRONLY|O_CREAT|O_TRUNC, 0644) = 3</w:t>
+      </w:r>
+      <w:r>
+        <w:rPr>
+          <w:rFonts w:ascii="Consolas" w:cs="Consolas" w:eastAsia="Consolas" w:hAnsi="Consolas"/>
+          <w:sz w:val="18"/>
+          <w:szCs w:val="18"/>
+        </w:rPr>
+        <w:br/>
+        <w:t xml:space="preserve">41  dup3(3, 1, 0)  = 1        (child 2: stdout -&gt; output file)</w:t>
       </w:r>
       <w:r>
         <w:rPr>
@@ -771,7 +809,7 @@
                 <w:sz w:val="20"/>
                 <w:szCs w:val="20"/>
               </w:rPr>
-              <w:t xml:space="preserve">dup2 / close</w:t>
+              <w:t xml:space="preserve">dup3 / close</w:t>
             </w:r>
           </w:p>
         </w:tc>
@@ -788,7 +826,7 @@
                 <w:sz w:val="20"/>
                 <w:szCs w:val="20"/>
               </w:rPr>
-              <w:t xml:space="preserve">In each child, several times, right after the clone.</w:t>
+              <w:t xml:space="preserve">In each child, several times, right after the clone (5 dup3 calls total in the filtered trace).</w:t>
             </w:r>
           </w:p>
         </w:tc>
@@ -805,7 +843,7 @@
                 <w:sz w:val="20"/>
                 <w:szCs w:val="20"/>
               </w:rPr>
-              <w:t xml:space="preserve">Rewires the child's stdin/stdout to the pipe (or to the output file) and then closes the original, now-duplicate fd so the pipe only has exactly the readers/writers we intend — this is what makes EOF propagate correctly.</w:t>
+              <w:t xml:space="preserve">This is glibc's dup2() — on modern Linux (and on aarch64, where the legacy dup2 syscall does not even exist) the C library implements dup2(old,new) as the dup3(old,new,0) syscall. It rewires the child's stdin/stdout to the pipe (or to the output file); the subsequent close() of the original fd ensures the pipe has exactly the readers/writers we intend, which is what makes EOF propagate correctly.</w:t>
             </w:r>
           </w:p>
         </w:tc>

</xml_diff>

<commit_message>
Rerun Q4 performance tests with 20 files so all three thread configs are distinct
- 2 / 10 (nproc) / 20 (max, one per file) threads now genuinely differ:
  ~0.130s / ~0.038s / ~0.035s, showing near-linear scaling up to core
  count and saturation beyond it
- Counts verified identical across configs and against grep -o
- Report: updated Q4 sections, added section 1.5 analyzing ELF binary
  loading (magic number, ELFCLASS64, EM_AARCH64, per-program library
  dependencies) as seen in the strace output
- README Q4 table updated accordingly
</commit_message>
<xml_diff>
--- a/docs/Project2_Report.docx
+++ b/docs/Project2_Report.docx
@@ -1016,7 +1016,142 @@
         <w:rPr>
           <w:rFonts w:ascii="Calibri" w:cs="Calibri" w:eastAsia="Calibri" w:hAnsi="Calibri"/>
         </w:rPr>
-        <w:t xml:space="preserve">Interpretation: the sequence pipe2 → clone → clone → (dup2/close in each child) → execve → exit_group → wait4 × 2 → openat(O_RDONLY) is exactly the textbook fork/exec/pipe pattern for building a two-stage pipeline in C, and the trace confirms every step actually executed as designed rather than the parent, e.g., accidentally reading its own pipe fd (which would deadlock) or leaking a pipe fd that would prevent EOF.</w:t>
+        <w:t xml:space="preserve">Interpretation: the sequence pipe2 → clone → clone → (dup3/close in each child) → execve → exit_group → wait4 × 2 → openat(O_RDONLY) is exactly the textbook fork/exec/pipe pattern for building a two-stage pipeline in C, and the trace confirms every step actually executed as designed rather than the parent, e.g., accidentally reading its own pipe fd (which would deadlock) or leaking a pipe fd that would prevent EOF.</w:t>
+      </w:r>
+    </w:p>
+    <w:p>
+      <w:pPr>
+        <w:pStyle w:val="Heading2"/>
+        <w:spacing w:after="120" w:before="240"/>
+      </w:pPr>
+      <w:r>
+        <w:rPr>
+          <w:b/>
+          <w:bCs/>
+        </w:rPr>
+        <w:t xml:space="preserve">1.5 ELF binary loading as seen through the trace</w:t>
+      </w:r>
+    </w:p>
+    <w:p>
+      <w:pPr>
+        <w:spacing w:after="120"/>
+      </w:pPr>
+      <w:r>
+        <w:rPr>
+          <w:rFonts w:ascii="Calibri" w:cs="Calibri" w:eastAsia="Calibri" w:hAnsi="Calibri"/>
+        </w:rPr>
+        <w:t xml:space="preserve">The trace also captures how the kernel and dynamic linker load each ELF binary involved (pipeline_ipc itself, then ps and grep after their execve calls). Immediately after each successful execve, the dynamic linker (ld.so) opens /etc/ld.so.cache, then opens each required shared library and reads its first 832 bytes:</w:t>
+      </w:r>
+    </w:p>
+    <w:p>
+      <w:pPr>
+        <w:pBdr>
+          <w:top w:val="single" w:color="CCCCCC" w:sz="2"/>
+          <w:bottom w:val="single" w:color="CCCCCC" w:sz="2"/>
+          <w:left w:val="single" w:color="CCCCCC" w:sz="2"/>
+          <w:right w:val="single" w:color="CCCCCC" w:sz="2"/>
+        </w:pBdr>
+        <w:shd w:fill="F2F2F2" w:val="clear"/>
+        <w:spacing w:after="200" w:before="100"/>
+      </w:pPr>
+      <w:r>
+        <w:rPr>
+          <w:rFonts w:ascii="Consolas" w:cs="Consolas" w:eastAsia="Consolas" w:hAnsi="Consolas"/>
+          <w:sz w:val="18"/>
+          <w:szCs w:val="18"/>
+        </w:rPr>
+        <w:t xml:space="preserve">52  openat(AT_FDCWD, "/lib/aarch64-linux-gnu/libprocps.so.8", O_RDONLY|O_CLOEXEC) = 3</w:t>
+      </w:r>
+      <w:r>
+        <w:rPr>
+          <w:rFonts w:ascii="Consolas" w:cs="Consolas" w:eastAsia="Consolas" w:hAnsi="Consolas"/>
+          <w:sz w:val="18"/>
+          <w:szCs w:val="18"/>
+        </w:rPr>
+        <w:br/>
+        <w:t xml:space="preserve">52  read(3, "\177ELF\2\1\1\0...\3\0\267\0\1\0...", 832) = 832</w:t>
+      </w:r>
+      <w:r>
+        <w:rPr>
+          <w:rFonts w:ascii="Consolas" w:cs="Consolas" w:eastAsia="Consolas" w:hAnsi="Consolas"/>
+          <w:sz w:val="18"/>
+          <w:szCs w:val="18"/>
+        </w:rPr>
+        <w:br/>
+        <w:t xml:space="preserve">53  openat(AT_FDCWD, "/lib/aarch64-linux-gnu/libpcre.so.3", O_RDONLY|O_CLOEXEC) = 3</w:t>
+      </w:r>
+      <w:r>
+        <w:rPr>
+          <w:rFonts w:ascii="Consolas" w:cs="Consolas" w:eastAsia="Consolas" w:hAnsi="Consolas"/>
+          <w:sz w:val="18"/>
+          <w:szCs w:val="18"/>
+        </w:rPr>
+        <w:br/>
+        <w:t xml:space="preserve">53  read(3, "\177ELF\2\1\1\0...", 832) = 832</w:t>
+      </w:r>
+    </w:p>
+    <w:p>
+      <w:pPr>
+        <w:pStyle w:val="ListParagraph"/>
+        <w:numPr>
+          <w:ilvl w:val="0"/>
+          <w:numId w:val="2"/>
+        </w:numPr>
+        <w:spacing w:after="60"/>
+      </w:pPr>
+      <w:r>
+        <w:rPr>
+          <w:rFonts w:ascii="Calibri" w:cs="Calibri" w:eastAsia="Calibri" w:hAnsi="Calibri"/>
+        </w:rPr>
+        <w:t xml:space="preserve">The bytes \177ELF (0x7F 'E' 'L' 'F') are the ELF magic number — the loader reads the ELF header plus program headers (832 bytes covers both) to learn where each loadable segment goes.</w:t>
+      </w:r>
+    </w:p>
+    <w:p>
+      <w:pPr>
+        <w:pStyle w:val="ListParagraph"/>
+        <w:numPr>
+          <w:ilvl w:val="0"/>
+          <w:numId w:val="2"/>
+        </w:numPr>
+        <w:spacing w:after="60"/>
+      </w:pPr>
+      <w:r>
+        <w:rPr>
+          <w:rFonts w:ascii="Calibri" w:cs="Calibri" w:eastAsia="Calibri" w:hAnsi="Calibri"/>
+        </w:rPr>
+        <w:t xml:space="preserve">Within that header, \2 = ELFCLASS64 (64-bit), \1 = little-endian, and the machine field \267\0 = 0xB7 = EM_AARCH64, confirming these are 64-bit ARM binaries — the trace literally exposes the ELF identification fields as they are parsed.</w:t>
+      </w:r>
+    </w:p>
+    <w:p>
+      <w:pPr>
+        <w:pStyle w:val="ListParagraph"/>
+        <w:numPr>
+          <w:ilvl w:val="0"/>
+          <w:numId w:val="2"/>
+        </w:numPr>
+        <w:spacing w:after="60"/>
+      </w:pPr>
+      <w:r>
+        <w:rPr>
+          <w:rFonts w:ascii="Calibri" w:cs="Calibri" w:eastAsia="Calibri" w:hAnsi="Calibri"/>
+        </w:rPr>
+        <w:t xml:space="preserve">After the header read, the loader mmap()s each library's text and data segments and mprotect()s them to the correct permissions (visible in the full, unfiltered log), then closes the fd — the library stays usable because the mapping, not the fd, is what matters.</w:t>
+      </w:r>
+    </w:p>
+    <w:p>
+      <w:pPr>
+        <w:pStyle w:val="ListParagraph"/>
+        <w:numPr>
+          <w:ilvl w:val="0"/>
+          <w:numId w:val="2"/>
+        </w:numPr>
+        <w:spacing w:after="60"/>
+      </w:pPr>
+      <w:r>
+        <w:rPr>
+          <w:rFonts w:ascii="Calibri" w:cs="Calibri" w:eastAsia="Calibri" w:hAnsi="Calibri"/>
+        </w:rPr>
+        <w:t xml:space="preserve">ps additionally loads libprocps.so.8 (its /proc parsing library) while grep loads libpcre.so.3 (its regex engine) — the trace therefore also reveals each program's distinct dynamic dependency set, information one would otherwise obtain from readelf -d or ldd.</w:t>
       </w:r>
     </w:p>
     <w:p>
@@ -2686,7 +2821,7 @@
         <w:rPr>
           <w:rFonts w:ascii="Calibri" w:cs="Calibri" w:eastAsia="Calibri" w:hAnsi="Calibri"/>
         </w:rPr>
-        <w:t xml:space="preserve">8 synthetic log files (~5 MB / 60,000 lines each, generated by the included gen_testfiles.c helper with a fixed per-file seed for reproducibility) containing a mix of the words error, warning, info, debug, system, network, fail, success, timeout, retry, connection. The keyword "error" appears roughly 120,000 times per file.</w:t>
+        <w:t xml:space="preserve">20 synthetic log files (~5 MB / 60,000 lines each — ~97 MB total, generated by the included gen_testfiles.c helper with a fixed per-file seed for reproducibility) containing a mix of the words error, warning, info, debug, system, network, fail, success, timeout, retry, connection. The keyword "error" appears roughly 120,000 times per file. The test container exposes 10 CPU cores (nproc = 10), so the three required configurations — 2 threads, core-count threads, and maximum threads (one per file) — are all genuinely distinct.</w:t>
       </w:r>
     </w:p>
     <w:p>
@@ -2793,7 +2928,7 @@
                 <w:sz w:val="20"/>
                 <w:szCs w:val="20"/>
               </w:rPr>
-              <w:t xml:space="preserve">Elapsed (best of 3 runs)</w:t>
+              <w:t xml:space="preserve">Elapsed (median of 3 runs)</w:t>
             </w:r>
           </w:p>
         </w:tc>
@@ -2846,7 +2981,7 @@
                 <w:sz w:val="20"/>
                 <w:szCs w:val="20"/>
               </w:rPr>
-              <w:t xml:space="preserve">8</w:t>
+              <w:t xml:space="preserve">20</w:t>
             </w:r>
           </w:p>
         </w:tc>
@@ -2863,7 +2998,7 @@
                 <w:sz w:val="20"/>
                 <w:szCs w:val="20"/>
               </w:rPr>
-              <w:t xml:space="preserve">≈ 0.074 s</w:t>
+              <w:t xml:space="preserve">≈ 0.130 s</w:t>
             </w:r>
           </w:p>
         </w:tc>
@@ -2882,7 +3017,7 @@
                 <w:sz w:val="20"/>
                 <w:szCs w:val="20"/>
               </w:rPr>
-              <w:t xml:space="preserve">8</w:t>
+              <w:t xml:space="preserve">10</w:t>
             </w:r>
           </w:p>
         </w:tc>
@@ -2899,7 +3034,7 @@
                 <w:sz w:val="20"/>
                 <w:szCs w:val="20"/>
               </w:rPr>
-              <w:t xml:space="preserve">"Average number of CPU cores" (container reported nproc = 10; clamped down to 8 because only 8 files were supplied — see note below)</w:t>
+              <w:t xml:space="preserve">Average number of CPU cores (nproc = 10)</w:t>
             </w:r>
           </w:p>
         </w:tc>
@@ -2916,7 +3051,7 @@
                 <w:sz w:val="20"/>
                 <w:szCs w:val="20"/>
               </w:rPr>
-              <w:t xml:space="preserve">8</w:t>
+              <w:t xml:space="preserve">20</w:t>
             </w:r>
           </w:p>
         </w:tc>
@@ -2933,7 +3068,7 @@
                 <w:sz w:val="20"/>
                 <w:szCs w:val="20"/>
               </w:rPr>
-              <w:t xml:space="preserve">≈ 0.024 s</w:t>
+              <w:t xml:space="preserve">≈ 0.038 s</w:t>
             </w:r>
           </w:p>
         </w:tc>
@@ -2952,7 +3087,7 @@
                 <w:sz w:val="20"/>
                 <w:szCs w:val="20"/>
               </w:rPr>
-              <w:t xml:space="preserve">8</w:t>
+              <w:t xml:space="preserve">20</w:t>
             </w:r>
           </w:p>
         </w:tc>
@@ -2969,7 +3104,7 @@
                 <w:sz w:val="20"/>
                 <w:szCs w:val="20"/>
               </w:rPr>
-              <w:t xml:space="preserve">"Maximum threads" (one thread per file — the point beyond which adding threads cannot help)</w:t>
+              <w:t xml:space="preserve">Maximum threads (one thread per file)</w:t>
             </w:r>
           </w:p>
         </w:tc>
@@ -2986,7 +3121,7 @@
                 <w:sz w:val="20"/>
                 <w:szCs w:val="20"/>
               </w:rPr>
-              <w:t xml:space="preserve">8</w:t>
+              <w:t xml:space="preserve">20</w:t>
             </w:r>
           </w:p>
         </w:tc>
@@ -3003,7 +3138,7 @@
                 <w:sz w:val="20"/>
                 <w:szCs w:val="20"/>
               </w:rPr>
-              <w:t xml:space="preserve">≈ 0.024 s</w:t>
+              <w:t xml:space="preserve">≈ 0.035 s</w:t>
             </w:r>
           </w:p>
         </w:tc>
@@ -3017,7 +3152,7 @@
         <w:rPr>
           <w:rFonts w:ascii="Calibri" w:cs="Calibri" w:eastAsia="Calibri" w:hAnsi="Calibri"/>
         </w:rPr>
-        <w:t xml:space="preserve">Note on the "average core count" row: the test container reported nproc = 10, but the program correctly clamps the requested thread count down to the number of files (8) since spawning more worker threads than there is work to hand out cannot improve throughput — those extra threads would just immediately exit their work-stealing loop. On a machine with more than 8 files to search (the realistic case this feature targets), the 10-thread and 8-thread rows would differ and the clamp would not trigger.</w:t>
+        <w:t xml:space="preserve">Raw trials — 2 threads: 0.143 / 0.129 / 0.130 s; 10 threads: 0.038 / 0.040 / 0.035 s; 20 threads: 0.037 / 0.035 / 0.035 s.</w:t>
       </w:r>
     </w:p>
     <w:p>
@@ -3028,7 +3163,7 @@
         <w:rPr>
           <w:rFonts w:ascii="Calibri" w:cs="Calibri" w:eastAsia="Calibri" w:hAnsi="Calibri"/>
         </w:rPr>
-        <w:t xml:space="preserve">Sample of the shared output file (results_8threads.txt):</w:t>
+        <w:t xml:space="preserve">Sample of the shared output file (results_10threads.txt, first and last lines):</w:t>
       </w:r>
     </w:p>
     <w:p>
@@ -3048,7 +3183,7 @@
           <w:sz w:val="18"/>
           <w:szCs w:val="18"/>
         </w:rPr>
-        <w:t xml:space="preserve">Keyword search results for "error" (threads=8, files=8)</w:t>
+        <w:t xml:space="preserve">Keyword search results for "error" (threads=10, files=20)</w:t>
       </w:r>
       <w:r>
         <w:rPr>
@@ -3066,70 +3201,34 @@
           <w:szCs w:val="18"/>
         </w:rPr>
         <w:br/>
-        <w:t xml:space="preserve">testfiles/log6.txt: 120492</w:t>
-      </w:r>
-      <w:r>
-        <w:rPr>
-          <w:rFonts w:ascii="Consolas" w:cs="Consolas" w:eastAsia="Consolas" w:hAnsi="Consolas"/>
-          <w:sz w:val="18"/>
-          <w:szCs w:val="18"/>
-        </w:rPr>
-        <w:br/>
-        <w:t xml:space="preserve">testfiles/log7.txt: 120168</w:t>
-      </w:r>
-      <w:r>
-        <w:rPr>
-          <w:rFonts w:ascii="Consolas" w:cs="Consolas" w:eastAsia="Consolas" w:hAnsi="Consolas"/>
-          <w:sz w:val="18"/>
-          <w:szCs w:val="18"/>
-        </w:rPr>
-        <w:br/>
-        <w:t xml:space="preserve">testfiles/log3.txt: 120451</w:t>
-      </w:r>
-      <w:r>
-        <w:rPr>
-          <w:rFonts w:ascii="Consolas" w:cs="Consolas" w:eastAsia="Consolas" w:hAnsi="Consolas"/>
-          <w:sz w:val="18"/>
-          <w:szCs w:val="18"/>
-        </w:rPr>
-        <w:br/>
-        <w:t xml:space="preserve">testfiles/log8.txt: 120280</w:t>
-      </w:r>
-      <w:r>
-        <w:rPr>
-          <w:rFonts w:ascii="Consolas" w:cs="Consolas" w:eastAsia="Consolas" w:hAnsi="Consolas"/>
-          <w:sz w:val="18"/>
-          <w:szCs w:val="18"/>
-        </w:rPr>
-        <w:br/>
-        <w:t xml:space="preserve">testfiles/log2.txt: 120585</w:t>
-      </w:r>
-      <w:r>
-        <w:rPr>
-          <w:rFonts w:ascii="Consolas" w:cs="Consolas" w:eastAsia="Consolas" w:hAnsi="Consolas"/>
-          <w:sz w:val="18"/>
-          <w:szCs w:val="18"/>
-        </w:rPr>
-        <w:br/>
-        <w:t xml:space="preserve">testfiles/log4.txt: 119834</w:t>
-      </w:r>
-      <w:r>
-        <w:rPr>
-          <w:rFonts w:ascii="Consolas" w:cs="Consolas" w:eastAsia="Consolas" w:hAnsi="Consolas"/>
-          <w:sz w:val="18"/>
-          <w:szCs w:val="18"/>
-        </w:rPr>
-        <w:br/>
-        <w:t xml:space="preserve">testfiles/log1.txt: 119730</w:t>
-      </w:r>
-      <w:r>
-        <w:rPr>
-          <w:rFonts w:ascii="Consolas" w:cs="Consolas" w:eastAsia="Consolas" w:hAnsi="Consolas"/>
-          <w:sz w:val="18"/>
-          <w:szCs w:val="18"/>
-        </w:rPr>
-        <w:br/>
-        <w:t xml:space="preserve">testfiles/log5.txt: 119974</w:t>
+        <w:t xml:space="preserve">tf/log3.txt: 120451</w:t>
+      </w:r>
+      <w:r>
+        <w:rPr>
+          <w:rFonts w:ascii="Consolas" w:cs="Consolas" w:eastAsia="Consolas" w:hAnsi="Consolas"/>
+          <w:sz w:val="18"/>
+          <w:szCs w:val="18"/>
+        </w:rPr>
+        <w:br/>
+        <w:t xml:space="preserve">tf/log4.txt: 119834</w:t>
+      </w:r>
+      <w:r>
+        <w:rPr>
+          <w:rFonts w:ascii="Consolas" w:cs="Consolas" w:eastAsia="Consolas" w:hAnsi="Consolas"/>
+          <w:sz w:val="18"/>
+          <w:szCs w:val="18"/>
+        </w:rPr>
+        <w:br/>
+        <w:t xml:space="preserve">tf/log2.txt: 120585</w:t>
+      </w:r>
+      <w:r>
+        <w:rPr>
+          <w:rFonts w:ascii="Consolas" w:cs="Consolas" w:eastAsia="Consolas" w:hAnsi="Consolas"/>
+          <w:sz w:val="18"/>
+          <w:szCs w:val="18"/>
+        </w:rPr>
+        <w:br/>
+        <w:t xml:space="preserve">...</w:t>
       </w:r>
       <w:r>
         <w:rPr>
@@ -3147,7 +3246,7 @@
           <w:szCs w:val="18"/>
         </w:rPr>
         <w:br/>
-        <w:t xml:space="preserve">Completed in 0.031414 seconds using 8 thread(s)</w:t>
+        <w:t xml:space="preserve">Completed in 0.034785 seconds using 10 thread(s)</w:t>
       </w:r>
     </w:p>
     <w:p>
@@ -3176,7 +3275,7 @@
         <w:rPr>
           <w:rFonts w:ascii="Calibri" w:cs="Calibri" w:eastAsia="Calibri" w:hAnsi="Calibri"/>
         </w:rPr>
-        <w:t xml:space="preserve">Going from 2 → 8 threads on an 8-file workload gives roughly a 3× speedup (≈ 0.074 s → ≈ 0.024 s), close to the theoretical 4× ceiling for doubling then quadrupling parallelism on an I/O-and-CPU-bound, evenly-sized, file-parallel workload — the shortfall from ideal scaling is attributable to per-thread creation/join overhead and brief contention on write_mutex when multiple threads finish around the same time.</w:t>
+        <w:t xml:space="preserve">Going from 2 → 10 threads gives a ~3.5× speedup (≈ 0.130 s → ≈ 0.038 s). Scaling is sub-linear relative to the 5× increase in threads because the workload is partly I/O-bound (all 20 files live on the same backing store, so some read time cannot be parallelized) and because of per-thread creation/join overhead plus brief contention on write_mutex when several threads finish near-simultaneously.</w:t>
       </w:r>
     </w:p>
     <w:p>
@@ -3192,7 +3291,7 @@
         <w:rPr>
           <w:rFonts w:ascii="Calibri" w:cs="Calibri" w:eastAsia="Calibri" w:hAnsi="Calibri"/>
         </w:rPr>
-        <w:t xml:space="preserve">Result order in the output file is non-deterministic (compare the file order across the three sample runs) because it reflects whichever thread finishes its file and acquires write_mutex first, not the order files were listed on the command line — this is expected and correct behavior for a concurrent work queue, and does not affect correctness since each line is unambiguously tagged with its filename.</w:t>
+        <w:t xml:space="preserve">Going from 10 → 20 threads yields essentially no further improvement (≈ 0.038 s → ≈ 0.035 s, within run-to-run noise). This is the expected saturation point: with only 10 physical cores, 20 runnable threads cannot execute more than 10-at-a-time; the extra threads just take turns on the same cores, adding scheduler context-switch overhead that roughly cancels any residual benefit from having I/O waits overlapped. This demonstrates the classic rule that for CPU-bound portions of a workload, thread count beyond the core count buys nothing.</w:t>
       </w:r>
     </w:p>
     <w:p>
@@ -3208,7 +3307,7 @@
         <w:rPr>
           <w:rFonts w:ascii="Calibri" w:cs="Calibri" w:eastAsia="Calibri" w:hAnsi="Calibri"/>
         </w:rPr>
-        <w:t xml:space="preserve">The per-file occurrence counts are stable across all three configurations (e.g. testfiles/log1.txt: 119730 in every run), confirming that thread count has no effect on correctness — only on wall-clock time — which is exactly what proper synchronization should guarantee.</w:t>
+        <w:t xml:space="preserve">Result order in the output file is non-deterministic (compare file order across the three results files) because it reflects whichever thread finishes its file and acquires write_mutex first, not the order files were listed on the command line — expected and correct behavior for a concurrent work queue; each line is unambiguously tagged with its filename.</w:t>
       </w:r>
     </w:p>
     <w:p>
@@ -3224,7 +3323,7 @@
         <w:rPr>
           <w:rFonts w:ascii="Calibri" w:cs="Calibri" w:eastAsia="Calibri" w:hAnsi="Calibri"/>
         </w:rPr>
-        <w:t xml:space="preserve">If the assignment is graded on a machine with more input files than CPU cores, re-running with the file count exceeding the core count would make the "average core count" and "max threads" rows diverge further, showing the more typical case where max-threads-equals-files provides the best throughput and additional threads beyond the file count provide no further benefit (since the work queue simply runs dry).</w:t>
+        <w:t xml:space="preserve">Correctness under concurrency was verified two independent ways: (1) the per-file counts in all three results files were sorted and diff'd — byte-for-byte identical across the 2-, 10-, and 20-thread runs, proving thread count affects only wall-clock time, never results; and (2) three files were spot-checked against grep -o error file | wc -l, which returned exactly the same counts (e.g. log1.txt: 119730, log20.txt: 120102). No line interleaving, loss, or duplication was observed in any run, confirming the write_mutex correctly serializes the shared output file.</w:t>
       </w:r>
     </w:p>
     <w:p>

</xml_diff>